<commit_message>
docs(siblings): OPERATOR_CREDENTIALS.{html,pdf,docx} catch-up regen
The .md was updated in f089dd6 but the sibling regenerations were not
staged. This commit adds the matching HTML/PDF/DOCX renders so all four
formats stay in sync.

Co-Authored-By: Claude Opus 4.7 <noreply@anthropic.com>
</commit_message>
<xml_diff>
--- a/docs/guides/OPERATOR_CREDENTIALS.docx
+++ b/docs/guides/OPERATOR_CREDENTIALS.docx
@@ -10,7 +10,7 @@
         <w:t xml:space="preserve">Herald</w:t>
       </w:r>
     </w:p>
-    <w:bookmarkStart w:id="59" w:name="herald--operator-credentials-guide"/>
+    <w:bookmarkStart w:id="71" w:name="herald--operator-credentials-guide"/>
     <w:p>
       <w:pPr>
         <w:pStyle w:val="Heading1"/>
@@ -8099,8 +8099,2535 @@
         <w:t xml:space="preserve">: Rotate the credential IMMEDIATELY (regenerate the token, change the password). Then escalate per Universal Constitution §11.4.10 — git-history scrubbing is forensic-quality only; the leaked value is forever compromised once pushed to a remote.</w:t>
       </w:r>
     </w:p>
+    <w:p>
+      <w:r>
+        <w:pict>
+          <v:rect style="width:0;height:1.5pt" o:hralign="center" o:hrstd="t" o:hr="t"/>
+        </w:pict>
+      </w:r>
+    </w:p>
     <w:bookmarkEnd w:id="58"/>
-    <w:bookmarkEnd w:id="59"/>
+    <w:bookmarkStart w:id="70" w:name="X7adbcb24ae4dc987cc359886d7848559c337be3"/>
+    <w:p>
+      <w:pPr>
+        <w:pStyle w:val="Heading2"/>
+      </w:pPr>
+      <w:r>
+        <w:t xml:space="preserve">MTProto user-account harness (Wave 8 Track B — REQUIRED for §11.4.98 compliance)</w:t>
+      </w:r>
+    </w:p>
+    <w:p>
+      <w:pPr>
+        <w:pStyle w:val="FirstParagraph"/>
+      </w:pPr>
+      <w:r>
+        <w:t xml:space="preserve">Per Universal Constitution §11.4.98 + Herald §108.m (anchored 2026-05-28): every live test MUST be re-runnable end-to-end without manual intervention. The Telegram Bot API alone cannot satisfy this for inbound-driven flows (</w:t>
+      </w:r>
+      <w:r>
+        <w:rPr>
+          <w:rStyle w:val="VerbatimChar"/>
+        </w:rPr>
+        <w:t xml:space="preserve">TestSubscribe_LiveBotAPI</w:t>
+      </w:r>
+      <w:r>
+        <w:t xml:space="preserve">,</w:t>
+      </w:r>
+      <w:r>
+        <w:t xml:space="preserve"> </w:t>
+      </w:r>
+      <w:r>
+        <w:rPr>
+          <w:rStyle w:val="VerbatimChar"/>
+        </w:rPr>
+        <w:t xml:space="preserve">tests/test_wave6_live_loop.sh</w:t>
+      </w:r>
+      <w:r>
+        <w:t xml:space="preserve">, Wave 6.5 lifecycle scenarios) because</w:t>
+      </w:r>
+      <w:r>
+        <w:t xml:space="preserve"> </w:t>
+      </w:r>
+      <w:r>
+        <w:rPr>
+          <w:b/>
+          <w:bCs/>
+        </w:rPr>
+        <w:t xml:space="preserve">bots cannot see other bots' messages in non-DM contexts</w:t>
+      </w:r>
+      <w:r>
+        <w:t xml:space="preserve"> </w:t>
+      </w:r>
+      <w:r>
+        <w:t xml:space="preserve">— empirically verified 2026-05-28 against group</w:t>
+      </w:r>
+      <w:r>
+        <w:t xml:space="preserve"> </w:t>
+      </w:r>
+      <w:r>
+        <w:rPr>
+          <w:rStyle w:val="VerbatimChar"/>
+        </w:rPr>
+        <w:t xml:space="preserve">-4946584787</w:t>
+      </w:r>
+      <w:r>
+        <w:t xml:space="preserve">:</w:t>
+      </w:r>
+      <w:r>
+        <w:t xml:space="preserve"> </w:t>
+      </w:r>
+      <w:r>
+        <w:rPr>
+          <w:rStyle w:val="VerbatimChar"/>
+        </w:rPr>
+        <w:t xml:space="preserve">@pherald_qa_bot</w:t>
+      </w:r>
+      <w:r>
+        <w:t xml:space="preserve"> </w:t>
+      </w:r>
+      <w:r>
+        <w:t xml:space="preserve">(id 8971749017) sent msg_id=18,</w:t>
+      </w:r>
+      <w:r>
+        <w:t xml:space="preserve"> </w:t>
+      </w:r>
+      <w:r>
+        <w:rPr>
+          <w:rStyle w:val="VerbatimChar"/>
+        </w:rPr>
+        <w:t xml:space="preserve">@atmosphere_worker_bot</w:t>
+      </w:r>
+      <w:r>
+        <w:t xml:space="preserve"> </w:t>
+      </w:r>
+      <w:r>
+        <w:t xml:space="preserve">observed 0 updates. Telegram's privacy boundary is structural, not configurable.</w:t>
+      </w:r>
+    </w:p>
+    <w:p>
+      <w:pPr>
+        <w:pStyle w:val="BodyText"/>
+      </w:pPr>
+      <w:r>
+        <w:t xml:space="preserve">Solution: drive QA tests from a</w:t>
+      </w:r>
+      <w:r>
+        <w:t xml:space="preserve"> </w:t>
+      </w:r>
+      <w:r>
+        <w:rPr>
+          <w:b/>
+          <w:bCs/>
+        </w:rPr>
+        <w:t xml:space="preserve">real Telegram user account</w:t>
+      </w:r>
+      <w:r>
+        <w:t xml:space="preserve"> </w:t>
+      </w:r>
+      <w:r>
+        <w:t xml:space="preserve">via the</w:t>
+      </w:r>
+      <w:r>
+        <w:t xml:space="preserve"> </w:t>
+      </w:r>
+      <w:r>
+        <w:rPr>
+          <w:b/>
+          <w:bCs/>
+        </w:rPr>
+        <w:t xml:space="preserve">MTProto protocol</w:t>
+      </w:r>
+      <w:r>
+        <w:t xml:space="preserve"> </w:t>
+      </w:r>
+      <w:r>
+        <w:t xml:space="preserve">(the same protocol Telegram apps use). The harness lives in</w:t>
+      </w:r>
+      <w:r>
+        <w:t xml:space="preserve"> </w:t>
+      </w:r>
+      <w:r>
+        <w:rPr>
+          <w:rStyle w:val="VerbatimChar"/>
+        </w:rPr>
+        <w:t xml:space="preserve">qaherald/internal/mtproto/</w:t>
+      </w:r>
+      <w:r>
+        <w:t xml:space="preserve"> </w:t>
+      </w:r>
+      <w:r>
+        <w:t xml:space="preserve">(vendor:</w:t>
+      </w:r>
+      <w:r>
+        <w:t xml:space="preserve"> </w:t>
+      </w:r>
+      <w:r>
+        <w:rPr>
+          <w:rStyle w:val="VerbatimChar"/>
+        </w:rPr>
+        <w:t xml:space="preserve">github.com/gotd/td</w:t>
+      </w:r>
+      <w:r>
+        <w:t xml:space="preserve">). A user account in the same chat as the bot can send messages that the bot's</w:t>
+      </w:r>
+      <w:r>
+        <w:t xml:space="preserve"> </w:t>
+      </w:r>
+      <w:r>
+        <w:rPr>
+          <w:rStyle w:val="VerbatimChar"/>
+        </w:rPr>
+        <w:t xml:space="preserve">getUpdates</w:t>
+      </w:r>
+      <w:r>
+        <w:t xml:space="preserve"> </w:t>
+      </w:r>
+      <w:r>
+        <w:t xml:space="preserve">poller picks up, enabling fully-autonomous closed-loop testing.</w:t>
+      </w:r>
+    </w:p>
+    <w:bookmarkStart w:id="60" w:name="variables-add-to-env"/>
+    <w:p>
+      <w:pPr>
+        <w:pStyle w:val="Heading3"/>
+      </w:pPr>
+      <w:r>
+        <w:t xml:space="preserve">Variables (add to</w:t>
+      </w:r>
+      <w:r>
+        <w:t xml:space="preserve"> </w:t>
+      </w:r>
+      <w:r>
+        <w:rPr>
+          <w:rStyle w:val="VerbatimChar"/>
+        </w:rPr>
+        <w:t xml:space="preserve">.env</w:t>
+      </w:r>
+      <w:r>
+        <w:t xml:space="preserve">)</w:t>
+      </w:r>
+    </w:p>
+    <w:tbl>
+      <w:tblPr>
+        <w:tblStyle w:val="Table"/>
+        <w:tblW w:type="auto" w:w="0"/>
+        <w:tblLook w:firstRow="1" w:lastRow="0" w:firstColumn="0" w:lastColumn="0" w:noHBand="0" w:noVBand="0" w:val="0020"/>
+      </w:tblPr>
+      <w:tblGrid>
+        <w:gridCol w:w="1980"/>
+        <w:gridCol w:w="1980"/>
+        <w:gridCol w:w="1980"/>
+        <w:gridCol w:w="1980"/>
+      </w:tblGrid>
+      <w:tr>
+        <w:trPr>
+          <w:tblHeader w:val="on"/>
+        </w:trPr>
+        <w:tc>
+          <w:tcPr/>
+          <w:p>
+            <w:pPr>
+              <w:pStyle w:val="Compact"/>
+            </w:pPr>
+            <w:r>
+              <w:t xml:space="preserve">Variable</w:t>
+            </w:r>
+          </w:p>
+        </w:tc>
+        <w:tc>
+          <w:tcPr/>
+          <w:p>
+            <w:pPr>
+              <w:pStyle w:val="Compact"/>
+            </w:pPr>
+            <w:r>
+              <w:t xml:space="preserve">What</w:t>
+            </w:r>
+          </w:p>
+        </w:tc>
+        <w:tc>
+          <w:tcPr/>
+          <w:p>
+            <w:pPr>
+              <w:pStyle w:val="Compact"/>
+            </w:pPr>
+            <w:r>
+              <w:t xml:space="preserve">Example shape</w:t>
+            </w:r>
+          </w:p>
+        </w:tc>
+        <w:tc>
+          <w:tcPr/>
+          <w:p>
+            <w:pPr>
+              <w:pStyle w:val="Compact"/>
+            </w:pPr>
+            <w:r>
+              <w:t xml:space="preserve">Source</w:t>
+            </w:r>
+          </w:p>
+        </w:tc>
+      </w:tr>
+      <w:tr>
+        <w:tc>
+          <w:tcPr/>
+          <w:p>
+            <w:pPr>
+              <w:pStyle w:val="Compact"/>
+            </w:pPr>
+            <w:r>
+              <w:rPr>
+                <w:rStyle w:val="VerbatimChar"/>
+              </w:rPr>
+              <w:t xml:space="preserve">HERALD_MTPROTO_APP_ID</w:t>
+            </w:r>
+          </w:p>
+        </w:tc>
+        <w:tc>
+          <w:tcPr/>
+          <w:p>
+            <w:pPr>
+              <w:pStyle w:val="Compact"/>
+            </w:pPr>
+            <w:r>
+              <w:t xml:space="preserve">App api_id</w:t>
+            </w:r>
+          </w:p>
+        </w:tc>
+        <w:tc>
+          <w:tcPr/>
+          <w:p>
+            <w:pPr>
+              <w:pStyle w:val="Compact"/>
+            </w:pPr>
+            <w:r>
+              <w:rPr>
+                <w:rStyle w:val="VerbatimChar"/>
+              </w:rPr>
+              <w:t xml:space="preserve">12345678</w:t>
+            </w:r>
+            <w:r>
+              <w:t xml:space="preserve"> </w:t>
+            </w:r>
+            <w:r>
+              <w:t xml:space="preserve">(integer, 5-8 digits)</w:t>
+            </w:r>
+          </w:p>
+        </w:tc>
+        <w:tc>
+          <w:tcPr/>
+          <w:p>
+            <w:pPr>
+              <w:pStyle w:val="Compact"/>
+            </w:pPr>
+            <w:hyperlink r:id="rId59">
+              <w:r>
+                <w:rPr>
+                  <w:rStyle w:val="Hyperlink"/>
+                </w:rPr>
+                <w:t xml:space="preserve">https://my.telegram.org/apps</w:t>
+              </w:r>
+            </w:hyperlink>
+          </w:p>
+        </w:tc>
+      </w:tr>
+      <w:tr>
+        <w:tc>
+          <w:tcPr/>
+          <w:p>
+            <w:pPr>
+              <w:pStyle w:val="Compact"/>
+            </w:pPr>
+            <w:r>
+              <w:rPr>
+                <w:rStyle w:val="VerbatimChar"/>
+              </w:rPr>
+              <w:t xml:space="preserve">HERALD_MTPROTO_APP_HASH</w:t>
+            </w:r>
+          </w:p>
+        </w:tc>
+        <w:tc>
+          <w:tcPr/>
+          <w:p>
+            <w:pPr>
+              <w:pStyle w:val="Compact"/>
+            </w:pPr>
+            <w:r>
+              <w:t xml:space="preserve">App api_hash</w:t>
+            </w:r>
+          </w:p>
+        </w:tc>
+        <w:tc>
+          <w:tcPr/>
+          <w:p>
+            <w:pPr>
+              <w:pStyle w:val="Compact"/>
+            </w:pPr>
+            <w:r>
+              <w:t xml:space="preserve">32-char lowercase hex</w:t>
+            </w:r>
+          </w:p>
+        </w:tc>
+        <w:tc>
+          <w:tcPr/>
+          <w:p>
+            <w:pPr>
+              <w:pStyle w:val="Compact"/>
+            </w:pPr>
+            <w:hyperlink r:id="rId59">
+              <w:r>
+                <w:rPr>
+                  <w:rStyle w:val="Hyperlink"/>
+                </w:rPr>
+                <w:t xml:space="preserve">https://my.telegram.org/apps</w:t>
+              </w:r>
+            </w:hyperlink>
+          </w:p>
+        </w:tc>
+      </w:tr>
+      <w:tr>
+        <w:tc>
+          <w:tcPr/>
+          <w:p>
+            <w:pPr>
+              <w:pStyle w:val="Compact"/>
+            </w:pPr>
+            <w:r>
+              <w:rPr>
+                <w:rStyle w:val="VerbatimChar"/>
+              </w:rPr>
+              <w:t xml:space="preserve">HERALD_MTPROTO_PHONE</w:t>
+            </w:r>
+          </w:p>
+        </w:tc>
+        <w:tc>
+          <w:tcPr/>
+          <w:p>
+            <w:pPr>
+              <w:pStyle w:val="Compact"/>
+            </w:pPr>
+            <w:r>
+              <w:t xml:space="preserve">QA-driver phone (E.164)</w:t>
+            </w:r>
+          </w:p>
+        </w:tc>
+        <w:tc>
+          <w:tcPr/>
+          <w:p>
+            <w:pPr>
+              <w:pStyle w:val="Compact"/>
+            </w:pPr>
+            <w:r>
+              <w:rPr>
+                <w:rStyle w:val="VerbatimChar"/>
+              </w:rPr>
+              <w:t xml:space="preserve">+12025551234</w:t>
+            </w:r>
+          </w:p>
+        </w:tc>
+        <w:tc>
+          <w:tcPr/>
+          <w:p>
+            <w:pPr>
+              <w:pStyle w:val="Compact"/>
+            </w:pPr>
+            <w:r>
+              <w:t xml:space="preserve">YOU choose — see "Account choice" below</w:t>
+            </w:r>
+          </w:p>
+        </w:tc>
+      </w:tr>
+      <w:tr>
+        <w:tc>
+          <w:tcPr/>
+          <w:p>
+            <w:pPr>
+              <w:pStyle w:val="Compact"/>
+            </w:pPr>
+            <w:r>
+              <w:rPr>
+                <w:rStyle w:val="VerbatimChar"/>
+              </w:rPr>
+              <w:t xml:space="preserve">HERALD_MTPROTO_PASSWORD</w:t>
+            </w:r>
+          </w:p>
+        </w:tc>
+        <w:tc>
+          <w:tcPr/>
+          <w:p>
+            <w:pPr>
+              <w:pStyle w:val="Compact"/>
+            </w:pPr>
+            <w:r>
+              <w:t xml:space="preserve">Cloud 2FA password</w:t>
+            </w:r>
+          </w:p>
+        </w:tc>
+        <w:tc>
+          <w:tcPr/>
+          <w:p>
+            <w:pPr>
+              <w:pStyle w:val="Compact"/>
+            </w:pPr>
+            <w:r>
+              <w:t xml:space="preserve">(32+ chars)</w:t>
+            </w:r>
+          </w:p>
+        </w:tc>
+        <w:tc>
+          <w:tcPr/>
+          <w:p>
+            <w:pPr>
+              <w:pStyle w:val="Compact"/>
+            </w:pPr>
+            <w:r>
+              <w:t xml:space="preserve">Set in Telegram → Settings → Privacy and Security → Two-Step Verification (only if 2FA enabled on the QA account)</w:t>
+            </w:r>
+          </w:p>
+        </w:tc>
+      </w:tr>
+      <w:tr>
+        <w:tc>
+          <w:tcPr/>
+          <w:p>
+            <w:pPr>
+              <w:pStyle w:val="Compact"/>
+            </w:pPr>
+            <w:r>
+              <w:rPr>
+                <w:rStyle w:val="VerbatimChar"/>
+              </w:rPr>
+              <w:t xml:space="preserve">HERALD_MTPROTO_SESSION_FILE</w:t>
+            </w:r>
+          </w:p>
+        </w:tc>
+        <w:tc>
+          <w:tcPr/>
+          <w:p>
+            <w:pPr>
+              <w:pStyle w:val="Compact"/>
+            </w:pPr>
+            <w:r>
+              <w:t xml:space="preserve">Persisted session path</w:t>
+            </w:r>
+          </w:p>
+        </w:tc>
+        <w:tc>
+          <w:tcPr/>
+          <w:p>
+            <w:pPr>
+              <w:pStyle w:val="Compact"/>
+            </w:pPr>
+            <w:r>
+              <w:rPr>
+                <w:rStyle w:val="VerbatimChar"/>
+              </w:rPr>
+              <w:t xml:space="preserve">~/.config/herald/mtproto.session</w:t>
+            </w:r>
+          </w:p>
+        </w:tc>
+        <w:tc>
+          <w:tcPr/>
+          <w:p>
+            <w:pPr>
+              <w:pStyle w:val="Compact"/>
+            </w:pPr>
+            <w:r>
+              <w:t xml:space="preserve">Optional — defaults to that path. Auto-created on first login.</w:t>
+            </w:r>
+          </w:p>
+        </w:tc>
+      </w:tr>
+    </w:tbl>
+    <w:bookmarkEnd w:id="60"/>
+    <w:bookmarkStart w:id="62" w:name="X817af55071539021e4bfa4eeb88f966b3063e60"/>
+    <w:p>
+      <w:pPr>
+        <w:pStyle w:val="Heading3"/>
+      </w:pPr>
+      <w:r>
+        <w:t xml:space="preserve">Step 1: Create the QA Telegram app at my.telegram.org</w:t>
+      </w:r>
+    </w:p>
+    <w:p>
+      <w:pPr>
+        <w:pStyle w:val="Compact"/>
+        <w:numPr>
+          <w:ilvl w:val="0"/>
+          <w:numId w:val="1013"/>
+        </w:numPr>
+      </w:pPr>
+      <w:r>
+        <w:t xml:space="preserve">Open</w:t>
+      </w:r>
+      <w:r>
+        <w:t xml:space="preserve"> </w:t>
+      </w:r>
+      <w:hyperlink r:id="rId61">
+        <w:r>
+          <w:rPr>
+            <w:rStyle w:val="Hyperlink"/>
+          </w:rPr>
+          <w:t xml:space="preserve">https://my.telegram.org/auth</w:t>
+        </w:r>
+      </w:hyperlink>
+      <w:r>
+        <w:t xml:space="preserve"> </w:t>
+      </w:r>
+      <w:r>
+        <w:t xml:space="preserve">in a browser.</w:t>
+      </w:r>
+    </w:p>
+    <w:p>
+      <w:pPr>
+        <w:pStyle w:val="Compact"/>
+        <w:numPr>
+          <w:ilvl w:val="0"/>
+          <w:numId w:val="1013"/>
+        </w:numPr>
+      </w:pPr>
+      <w:r>
+        <w:t xml:space="preserve">Enter the</w:t>
+      </w:r>
+      <w:r>
+        <w:t xml:space="preserve"> </w:t>
+      </w:r>
+      <w:r>
+        <w:rPr>
+          <w:b/>
+          <w:bCs/>
+        </w:rPr>
+        <w:t xml:space="preserve">QA-driver phone</w:t>
+      </w:r>
+      <w:r>
+        <w:t xml:space="preserve"> </w:t>
+      </w:r>
+      <w:r>
+        <w:t xml:space="preserve">(the one you'll use for</w:t>
+      </w:r>
+      <w:r>
+        <w:t xml:space="preserve"> </w:t>
+      </w:r>
+      <w:r>
+        <w:rPr>
+          <w:rStyle w:val="VerbatimChar"/>
+        </w:rPr>
+        <w:t xml:space="preserve">HERALD_MTPROTO_PHONE</w:t>
+      </w:r>
+      <w:r>
+        <w:t xml:space="preserve"> </w:t>
+      </w:r>
+      <w:r>
+        <w:t xml:space="preserve">— see "Account choice" below for guidance).</w:t>
+      </w:r>
+    </w:p>
+    <w:p>
+      <w:pPr>
+        <w:pStyle w:val="Compact"/>
+        <w:numPr>
+          <w:ilvl w:val="0"/>
+          <w:numId w:val="1013"/>
+        </w:numPr>
+      </w:pPr>
+      <w:r>
+        <w:t xml:space="preserve">Telegram sends a login code to that phone's Telegram app (NOT SMS this time — only the in-app code).</w:t>
+      </w:r>
+    </w:p>
+    <w:p>
+      <w:pPr>
+        <w:pStyle w:val="Compact"/>
+        <w:numPr>
+          <w:ilvl w:val="0"/>
+          <w:numId w:val="1013"/>
+        </w:numPr>
+      </w:pPr>
+      <w:r>
+        <w:t xml:space="preserve">Enter the code at my.telegram.org/auth.</w:t>
+      </w:r>
+    </w:p>
+    <w:p>
+      <w:pPr>
+        <w:pStyle w:val="Compact"/>
+        <w:numPr>
+          <w:ilvl w:val="0"/>
+          <w:numId w:val="1013"/>
+        </w:numPr>
+      </w:pPr>
+      <w:r>
+        <w:t xml:space="preserve">After login, navigate to</w:t>
+      </w:r>
+      <w:r>
+        <w:t xml:space="preserve"> </w:t>
+      </w:r>
+      <w:hyperlink r:id="rId59">
+        <w:r>
+          <w:rPr>
+            <w:rStyle w:val="Hyperlink"/>
+          </w:rPr>
+          <w:t xml:space="preserve">https://my.telegram.org/apps</w:t>
+        </w:r>
+      </w:hyperlink>
+      <w:r>
+        <w:t xml:space="preserve">.</w:t>
+      </w:r>
+    </w:p>
+    <w:p>
+      <w:pPr>
+        <w:pStyle w:val="Compact"/>
+        <w:numPr>
+          <w:ilvl w:val="0"/>
+          <w:numId w:val="1013"/>
+        </w:numPr>
+      </w:pPr>
+      <w:r>
+        <w:rPr>
+          <w:b/>
+          <w:bCs/>
+        </w:rPr>
+        <w:t xml:space="preserve">First-time:</w:t>
+      </w:r>
+      <w:r>
+        <w:t xml:space="preserve"> </w:t>
+      </w:r>
+      <w:r>
+        <w:t xml:space="preserve">click "Create new application". Fill in (values updated 2026-05-28 after operator reported</w:t>
+      </w:r>
+      <w:r>
+        <w:t xml:space="preserve"> </w:t>
+      </w:r>
+      <w:r>
+        <w:rPr>
+          <w:rStyle w:val="VerbatimChar"/>
+        </w:rPr>
+        <w:t xml:space="preserve">Incorrect app name</w:t>
+      </w:r>
+      <w:r>
+        <w:t xml:space="preserve"> </w:t>
+      </w:r>
+      <w:r>
+        <w:t xml:space="preserve">validation error):</w:t>
+      </w:r>
+    </w:p>
+    <w:p>
+      <w:pPr>
+        <w:pStyle w:val="Compact"/>
+        <w:numPr>
+          <w:ilvl w:val="1"/>
+          <w:numId w:val="1014"/>
+        </w:numPr>
+      </w:pPr>
+      <w:r>
+        <w:rPr>
+          <w:b/>
+          <w:bCs/>
+        </w:rPr>
+        <w:t xml:space="preserve">App title:</w:t>
+      </w:r>
+      <w:r>
+        <w:t xml:space="preserve"> </w:t>
+      </w:r>
+      <w:r>
+        <w:rPr>
+          <w:rStyle w:val="VerbatimChar"/>
+        </w:rPr>
+        <w:t xml:space="preserve">Herald</w:t>
+      </w:r>
+      <w:r>
+        <w:t xml:space="preserve"> </w:t>
+      </w:r>
+      <w:r>
+        <w:t xml:space="preserve">(simplest; works almost always) — fallbacks:</w:t>
+      </w:r>
+      <w:r>
+        <w:t xml:space="preserve"> </w:t>
+      </w:r>
+      <w:r>
+        <w:rPr>
+          <w:rStyle w:val="VerbatimChar"/>
+        </w:rPr>
+        <w:t xml:space="preserve">HeraldQA</w:t>
+      </w:r>
+      <w:r>
+        <w:t xml:space="preserve"> </w:t>
+      </w:r>
+      <w:r>
+        <w:t xml:space="preserve">(camelCase) →</w:t>
+      </w:r>
+      <w:r>
+        <w:t xml:space="preserve"> </w:t>
+      </w:r>
+      <w:r>
+        <w:rPr>
+          <w:rStyle w:val="VerbatimChar"/>
+        </w:rPr>
+        <w:t xml:space="preserve">Herald Test Harness</w:t>
+      </w:r>
+      <w:r>
+        <w:t xml:space="preserve"> </w:t>
+      </w:r>
+      <w:r>
+        <w:t xml:space="preserve">→</w:t>
+      </w:r>
+      <w:r>
+        <w:t xml:space="preserve"> </w:t>
+      </w:r>
+      <w:r>
+        <w:rPr>
+          <w:rStyle w:val="VerbatimChar"/>
+        </w:rPr>
+        <w:t xml:space="preserve">Herald Tools</w:t>
+      </w:r>
+      <w:r>
+        <w:t xml:space="preserve"> </w:t>
+      </w:r>
+      <w:r>
+        <w:t xml:space="preserve">→</w:t>
+      </w:r>
+      <w:r>
+        <w:t xml:space="preserve"> </w:t>
+      </w:r>
+      <w:r>
+        <w:rPr>
+          <w:rStyle w:val="VerbatimChar"/>
+        </w:rPr>
+        <w:t xml:space="preserve">Herald Lab</w:t>
+      </w:r>
+      <w:r>
+        <w:t xml:space="preserve">.</w:t>
+      </w:r>
+      <w:r>
+        <w:t xml:space="preserve"> </w:t>
+      </w:r>
+      <w:r>
+        <w:rPr>
+          <w:b/>
+          <w:bCs/>
+        </w:rPr>
+        <w:t xml:space="preserve">AVOID bare acronyms like</w:t>
+      </w:r>
+      <w:r>
+        <w:rPr>
+          <w:b/>
+          <w:bCs/>
+        </w:rPr>
+        <w:t xml:space="preserve"> </w:t>
+      </w:r>
+      <w:r>
+        <w:rPr>
+          <w:rStyle w:val="VerbatimChar"/>
+          <w:b/>
+          <w:bCs/>
+        </w:rPr>
+        <w:t xml:space="preserve">QA</w:t>
+      </w:r>
+      <w:r>
+        <w:t xml:space="preserve"> </w:t>
+      </w:r>
+      <w:r>
+        <w:t xml:space="preserve">— Telegram's classifier rejects them with</w:t>
+      </w:r>
+      <w:r>
+        <w:t xml:space="preserve"> </w:t>
+      </w:r>
+      <w:r>
+        <w:rPr>
+          <w:rStyle w:val="VerbatimChar"/>
+        </w:rPr>
+        <w:t xml:space="preserve">Incorrect app name</w:t>
+      </w:r>
+      <w:r>
+        <w:t xml:space="preserve">.</w:t>
+      </w:r>
+    </w:p>
+    <w:p>
+      <w:pPr>
+        <w:pStyle w:val="Compact"/>
+        <w:numPr>
+          <w:ilvl w:val="1"/>
+          <w:numId w:val="1014"/>
+        </w:numPr>
+      </w:pPr>
+      <w:r>
+        <w:rPr>
+          <w:b/>
+          <w:bCs/>
+        </w:rPr>
+        <w:t xml:space="preserve">Short name:</w:t>
+      </w:r>
+      <w:r>
+        <w:t xml:space="preserve"> </w:t>
+      </w:r>
+      <w:r>
+        <w:rPr>
+          <w:rStyle w:val="VerbatimChar"/>
+        </w:rPr>
+        <w:t xml:space="preserve">herald_qa_&lt;random4&gt;</w:t>
+      </w:r>
+      <w:r>
+        <w:t xml:space="preserve"> </w:t>
+      </w:r>
+      <w:r>
+        <w:t xml:space="preserve">(e.g.</w:t>
+      </w:r>
+      <w:r>
+        <w:t xml:space="preserve"> </w:t>
+      </w:r>
+      <w:r>
+        <w:rPr>
+          <w:rStyle w:val="VerbatimChar"/>
+        </w:rPr>
+        <w:t xml:space="preserve">herald_qa_5kx9</w:t>
+      </w:r>
+      <w:r>
+        <w:t xml:space="preserve">) — must be 5-32 chars, alphanumeric + underscore only, GLOBALLY UNIQUE across all Telegram apps. Plain</w:t>
+      </w:r>
+      <w:r>
+        <w:t xml:space="preserve"> </w:t>
+      </w:r>
+      <w:r>
+        <w:rPr>
+          <w:rStyle w:val="VerbatimChar"/>
+        </w:rPr>
+        <w:t xml:space="preserve">herald_qa</w:t>
+      </w:r>
+      <w:r>
+        <w:t xml:space="preserve"> </w:t>
+      </w:r>
+      <w:r>
+        <w:t xml:space="preserve">may already be taken.</w:t>
+      </w:r>
+    </w:p>
+    <w:p>
+      <w:pPr>
+        <w:pStyle w:val="Compact"/>
+        <w:numPr>
+          <w:ilvl w:val="1"/>
+          <w:numId w:val="1014"/>
+        </w:numPr>
+      </w:pPr>
+      <w:r>
+        <w:rPr>
+          <w:b/>
+          <w:bCs/>
+        </w:rPr>
+        <w:t xml:space="preserve">URL:</w:t>
+      </w:r>
+      <w:r>
+        <w:t xml:space="preserve"> </w:t>
+      </w:r>
+      <w:r>
+        <w:rPr>
+          <w:rStyle w:val="VerbatimChar"/>
+        </w:rPr>
+        <w:t xml:space="preserve">https://herald.local</w:t>
+      </w:r>
+      <w:r>
+        <w:t xml:space="preserve"> </w:t>
+      </w:r>
+      <w:r>
+        <w:t xml:space="preserve">(or any valid</w:t>
+      </w:r>
+      <w:r>
+        <w:t xml:space="preserve"> </w:t>
+      </w:r>
+      <w:r>
+        <w:rPr>
+          <w:rStyle w:val="VerbatimChar"/>
+        </w:rPr>
+        <w:t xml:space="preserve">http(s)://</w:t>
+      </w:r>
+      <w:r>
+        <w:t xml:space="preserve"> </w:t>
+      </w:r>
+      <w:r>
+        <w:t xml:space="preserve">URL — Telegram requires the</w:t>
+      </w:r>
+      <w:r>
+        <w:t xml:space="preserve"> </w:t>
+      </w:r>
+      <w:r>
+        <w:rPr>
+          <w:rStyle w:val="VerbatimChar"/>
+        </w:rPr>
+        <w:t xml:space="preserve">http(s)://</w:t>
+      </w:r>
+      <w:r>
+        <w:t xml:space="preserve"> </w:t>
+      </w:r>
+      <w:r>
+        <w:t xml:space="preserve">prefix; bare domains rejected). Field is NOT actually optional.</w:t>
+      </w:r>
+    </w:p>
+    <w:p>
+      <w:pPr>
+        <w:pStyle w:val="Compact"/>
+        <w:numPr>
+          <w:ilvl w:val="1"/>
+          <w:numId w:val="1014"/>
+        </w:numPr>
+      </w:pPr>
+      <w:r>
+        <w:rPr>
+          <w:b/>
+          <w:bCs/>
+        </w:rPr>
+        <w:t xml:space="preserve">Platform:</w:t>
+      </w:r>
+      <w:r>
+        <w:t xml:space="preserve"> </w:t>
+      </w:r>
+      <w:r>
+        <w:rPr>
+          <w:rStyle w:val="VerbatimChar"/>
+        </w:rPr>
+        <w:t xml:space="preserve">Desktop</w:t>
+      </w:r>
+      <w:r>
+        <w:t xml:space="preserve"> </w:t>
+      </w:r>
+      <w:r>
+        <w:t xml:space="preserve">(fallback if</w:t>
+      </w:r>
+      <w:r>
+        <w:t xml:space="preserve"> </w:t>
+      </w:r>
+      <w:r>
+        <w:rPr>
+          <w:rStyle w:val="VerbatimChar"/>
+        </w:rPr>
+        <w:t xml:space="preserve">Other</w:t>
+      </w:r>
+      <w:r>
+        <w:t xml:space="preserve"> </w:t>
+      </w:r>
+      <w:r>
+        <w:t xml:space="preserve">is rejected on your Telegram form version).</w:t>
+      </w:r>
+    </w:p>
+    <w:p>
+      <w:pPr>
+        <w:pStyle w:val="Compact"/>
+        <w:numPr>
+          <w:ilvl w:val="1"/>
+          <w:numId w:val="1014"/>
+        </w:numPr>
+      </w:pPr>
+      <w:r>
+        <w:rPr>
+          <w:b/>
+          <w:bCs/>
+        </w:rPr>
+        <w:t xml:space="preserve">Description:</w:t>
+      </w:r>
+      <w:r>
+        <w:t xml:space="preserve"> </w:t>
+      </w:r>
+      <w:r>
+        <w:rPr>
+          <w:rStyle w:val="VerbatimChar"/>
+        </w:rPr>
+        <w:t xml:space="preserve">Herald automation harness for closed-loop testing.</w:t>
+      </w:r>
+      <w:r>
+        <w:t xml:space="preserve"> </w:t>
+      </w:r>
+      <w:r>
+        <w:t xml:space="preserve">(plain ASCII; no</w:t>
+      </w:r>
+      <w:r>
+        <w:t xml:space="preserve"> </w:t>
+      </w:r>
+      <w:r>
+        <w:rPr>
+          <w:rStyle w:val="VerbatimChar"/>
+        </w:rPr>
+        <w:t xml:space="preserve">§</w:t>
+      </w:r>
+      <w:r>
+        <w:t xml:space="preserve"> </w:t>
+      </w:r>
+      <w:r>
+        <w:t xml:space="preserve">symbol; under 200 chars; avoid acronyms QA/CI/CD).</w:t>
+      </w:r>
+    </w:p>
+    <w:p>
+      <w:pPr>
+        <w:pStyle w:val="Compact"/>
+        <w:numPr>
+          <w:ilvl w:val="0"/>
+          <w:numId w:val="1013"/>
+        </w:numPr>
+      </w:pPr>
+      <w:r>
+        <w:t xml:space="preserve">Click "Create application".</w:t>
+      </w:r>
+      <w:r>
+        <w:t xml:space="preserve"> </w:t>
+      </w:r>
+      <w:r>
+        <w:rPr>
+          <w:b/>
+          <w:bCs/>
+        </w:rPr>
+        <w:t xml:space="preserve">If you get</w:t>
+      </w:r>
+      <w:r>
+        <w:rPr>
+          <w:b/>
+          <w:bCs/>
+        </w:rPr>
+        <w:t xml:space="preserve"> </w:t>
+      </w:r>
+      <w:r>
+        <w:rPr>
+          <w:rStyle w:val="VerbatimChar"/>
+          <w:b/>
+          <w:bCs/>
+        </w:rPr>
+        <w:t xml:space="preserve">Incorrect app name</w:t>
+      </w:r>
+      <w:r>
+        <w:t xml:space="preserve"> </w:t>
+      </w:r>
+      <w:r>
+        <w:t xml:space="preserve">— the App title contains a bare acronym Telegram flags as non-app-like; try the fallback titles above in order.</w:t>
+      </w:r>
+    </w:p>
+    <w:p>
+      <w:pPr>
+        <w:pStyle w:val="Compact"/>
+        <w:numPr>
+          <w:ilvl w:val="0"/>
+          <w:numId w:val="1013"/>
+        </w:numPr>
+      </w:pPr>
+      <w:r>
+        <w:t xml:space="preserve">Telegram displays:</w:t>
+      </w:r>
+    </w:p>
+    <w:p>
+      <w:pPr>
+        <w:pStyle w:val="Compact"/>
+        <w:numPr>
+          <w:ilvl w:val="1"/>
+          <w:numId w:val="1015"/>
+        </w:numPr>
+      </w:pPr>
+      <w:r>
+        <w:rPr>
+          <w:rStyle w:val="VerbatimChar"/>
+        </w:rPr>
+        <w:t xml:space="preserve">App api_id</w:t>
+      </w:r>
+      <w:r>
+        <w:t xml:space="preserve"> </w:t>
+      </w:r>
+      <w:r>
+        <w:t xml:space="preserve">— small integer (5-8 digits) → set as</w:t>
+      </w:r>
+      <w:r>
+        <w:t xml:space="preserve"> </w:t>
+      </w:r>
+      <w:r>
+        <w:rPr>
+          <w:rStyle w:val="VerbatimChar"/>
+        </w:rPr>
+        <w:t xml:space="preserve">HERALD_MTPROTO_APP_ID</w:t>
+      </w:r>
+    </w:p>
+    <w:p>
+      <w:pPr>
+        <w:pStyle w:val="Compact"/>
+        <w:numPr>
+          <w:ilvl w:val="1"/>
+          <w:numId w:val="1015"/>
+        </w:numPr>
+      </w:pPr>
+      <w:r>
+        <w:rPr>
+          <w:rStyle w:val="VerbatimChar"/>
+        </w:rPr>
+        <w:t xml:space="preserve">App api_hash</w:t>
+      </w:r>
+      <w:r>
+        <w:t xml:space="preserve"> </w:t>
+      </w:r>
+      <w:r>
+        <w:t xml:space="preserve">— 32-char hex string → set as</w:t>
+      </w:r>
+      <w:r>
+        <w:t xml:space="preserve"> </w:t>
+      </w:r>
+      <w:r>
+        <w:rPr>
+          <w:rStyle w:val="VerbatimChar"/>
+        </w:rPr>
+        <w:t xml:space="preserve">HERALD_MTPROTO_APP_HASH</w:t>
+      </w:r>
+    </w:p>
+    <w:p>
+      <w:pPr>
+        <w:pStyle w:val="Compact"/>
+        <w:numPr>
+          <w:ilvl w:val="0"/>
+          <w:numId w:val="1013"/>
+        </w:numPr>
+      </w:pPr>
+      <w:r>
+        <w:rPr>
+          <w:b/>
+          <w:bCs/>
+        </w:rPr>
+        <w:t xml:space="preserve">Copy both immediately.</w:t>
+      </w:r>
+      <w:r>
+        <w:t xml:space="preserve"> </w:t>
+      </w:r>
+      <w:r>
+        <w:t xml:space="preserve">my.telegram.org will not let you re-display the api_hash once you navigate away (you can revoke + recreate the app if lost, but existing sessions break).</w:t>
+      </w:r>
+    </w:p>
+    <w:bookmarkEnd w:id="62"/>
+    <w:bookmarkStart w:id="63" w:name="X04eb5f97382619c2e4d93fde25e82ce998c76c9"/>
+    <w:p>
+      <w:pPr>
+        <w:pStyle w:val="Heading3"/>
+      </w:pPr>
+      <w:r>
+        <w:t xml:space="preserve">Step 2: Account choice — which phone to use</w:t>
+      </w:r>
+    </w:p>
+    <w:p>
+      <w:pPr>
+        <w:pStyle w:val="FirstParagraph"/>
+      </w:pPr>
+      <w:r>
+        <w:t xml:space="preserve">The phone in</w:t>
+      </w:r>
+      <w:r>
+        <w:t xml:space="preserve"> </w:t>
+      </w:r>
+      <w:r>
+        <w:rPr>
+          <w:rStyle w:val="VerbatimChar"/>
+        </w:rPr>
+        <w:t xml:space="preserve">HERALD_MTPROTO_PHONE</w:t>
+      </w:r>
+      <w:r>
+        <w:t xml:space="preserve"> </w:t>
+      </w:r>
+      <w:r>
+        <w:t xml:space="preserve">MUST belong to a Telegram</w:t>
+      </w:r>
+      <w:r>
+        <w:t xml:space="preserve"> </w:t>
+      </w:r>
+      <w:r>
+        <w:rPr>
+          <w:b/>
+          <w:bCs/>
+        </w:rPr>
+        <w:t xml:space="preserve">user account</w:t>
+      </w:r>
+      <w:r>
+        <w:t xml:space="preserve"> </w:t>
+      </w:r>
+      <w:r>
+        <w:t xml:space="preserve">(not a bot). Three options:</w:t>
+      </w:r>
+    </w:p>
+    <w:tbl>
+      <w:tblPr>
+        <w:tblStyle w:val="Table"/>
+        <w:tblW w:type="auto" w:w="0"/>
+        <w:tblLook w:firstRow="1" w:lastRow="0" w:firstColumn="0" w:lastColumn="0" w:noHBand="0" w:noVBand="0" w:val="0020"/>
+      </w:tblPr>
+      <w:tblGrid>
+        <w:gridCol w:w="2640"/>
+        <w:gridCol w:w="2640"/>
+        <w:gridCol w:w="2640"/>
+      </w:tblGrid>
+      <w:tr>
+        <w:trPr>
+          <w:tblHeader w:val="on"/>
+        </w:trPr>
+        <w:tc>
+          <w:tcPr/>
+          <w:p>
+            <w:pPr>
+              <w:pStyle w:val="Compact"/>
+            </w:pPr>
+            <w:r>
+              <w:t xml:space="preserve">Option</w:t>
+            </w:r>
+          </w:p>
+        </w:tc>
+        <w:tc>
+          <w:tcPr/>
+          <w:p>
+            <w:pPr>
+              <w:pStyle w:val="Compact"/>
+            </w:pPr>
+            <w:r>
+              <w:t xml:space="preserve">Pros</w:t>
+            </w:r>
+          </w:p>
+        </w:tc>
+        <w:tc>
+          <w:tcPr/>
+          <w:p>
+            <w:pPr>
+              <w:pStyle w:val="Compact"/>
+            </w:pPr>
+            <w:r>
+              <w:t xml:space="preserve">Cons</w:t>
+            </w:r>
+          </w:p>
+        </w:tc>
+      </w:tr>
+      <w:tr>
+        <w:tc>
+          <w:tcPr/>
+          <w:p>
+            <w:pPr>
+              <w:pStyle w:val="Compact"/>
+            </w:pPr>
+            <w:r>
+              <w:rPr>
+                <w:b/>
+                <w:bCs/>
+              </w:rPr>
+              <w:t xml:space="preserve">(a) Your personal Telegram account</w:t>
+            </w:r>
+          </w:p>
+        </w:tc>
+        <w:tc>
+          <w:tcPr/>
+          <w:p>
+            <w:pPr>
+              <w:pStyle w:val="Compact"/>
+            </w:pPr>
+            <w:r>
+              <w:t xml:space="preserve">Fastest setup. No SIM/VoIP needed.</w:t>
+            </w:r>
+          </w:p>
+        </w:tc>
+        <w:tc>
+          <w:tcPr/>
+          <w:p>
+            <w:pPr>
+              <w:pStyle w:val="Compact"/>
+            </w:pPr>
+            <w:r>
+              <w:t xml:space="preserve">Test runs send messages "from you" in the QA chat — visible to anyone in the group. Account-level mistakes (e.g. bug deletes all messages) hit your real account. Not recommended for production CI.</w:t>
+            </w:r>
+          </w:p>
+        </w:tc>
+      </w:tr>
+      <w:tr>
+        <w:tc>
+          <w:tcPr/>
+          <w:p>
+            <w:pPr>
+              <w:pStyle w:val="Compact"/>
+            </w:pPr>
+            <w:r>
+              <w:rPr>
+                <w:b/>
+                <w:bCs/>
+              </w:rPr>
+              <w:t xml:space="preserve">(b) Dedicated QA SIM</w:t>
+            </w:r>
+          </w:p>
+        </w:tc>
+        <w:tc>
+          <w:tcPr/>
+          <w:p>
+            <w:pPr>
+              <w:pStyle w:val="Compact"/>
+            </w:pPr>
+            <w:r>
+              <w:t xml:space="preserve">Clean separation. Account is purpose-built.</w:t>
+            </w:r>
+          </w:p>
+        </w:tc>
+        <w:tc>
+          <w:tcPr/>
+          <w:p>
+            <w:pPr>
+              <w:pStyle w:val="Compact"/>
+            </w:pPr>
+            <w:r>
+              <w:t xml:space="preserve">Requires a physical SIM and ~$10-20/month.</w:t>
+            </w:r>
+          </w:p>
+        </w:tc>
+      </w:tr>
+      <w:tr>
+        <w:tc>
+          <w:tcPr/>
+          <w:p>
+            <w:pPr>
+              <w:pStyle w:val="Compact"/>
+            </w:pPr>
+            <w:r>
+              <w:rPr>
+                <w:b/>
+                <w:bCs/>
+              </w:rPr>
+              <w:t xml:space="preserve">(c) Voice-over-IP (Google Voice / Twilio / TextNow) number</w:t>
+            </w:r>
+          </w:p>
+        </w:tc>
+        <w:tc>
+          <w:tcPr/>
+          <w:p>
+            <w:pPr>
+              <w:pStyle w:val="Compact"/>
+            </w:pPr>
+            <w:r>
+              <w:t xml:space="preserve">No physical SIM. Free or cheap.</w:t>
+            </w:r>
+          </w:p>
+        </w:tc>
+        <w:tc>
+          <w:tcPr/>
+          <w:p>
+            <w:pPr>
+              <w:pStyle w:val="Compact"/>
+            </w:pPr>
+            <w:r>
+              <w:t xml:space="preserve">Telegram increasingly rejects VoIP numbers — works ~60% of the time. Try first; fall back to (b).</w:t>
+            </w:r>
+          </w:p>
+        </w:tc>
+      </w:tr>
+    </w:tbl>
+    <w:p>
+      <w:pPr>
+        <w:pStyle w:val="BodyText"/>
+      </w:pPr>
+      <w:r>
+        <w:rPr>
+          <w:b/>
+          <w:bCs/>
+        </w:rPr>
+        <w:t xml:space="preserve">Operator recommendation for first-cycle:</w:t>
+      </w:r>
+      <w:r>
+        <w:t xml:space="preserve"> </w:t>
+      </w:r>
+      <w:r>
+        <w:t xml:space="preserve">use (a) your personal account. Once the harness is proven working, migrate to (b) for steady-state. The session file is portable — just</w:t>
+      </w:r>
+      <w:r>
+        <w:t xml:space="preserve"> </w:t>
+      </w:r>
+      <w:r>
+        <w:rPr>
+          <w:rStyle w:val="VerbatimChar"/>
+        </w:rPr>
+        <w:t xml:space="preserve">HERALD_MTPROTO_PHONE</w:t>
+      </w:r>
+      <w:r>
+        <w:t xml:space="preserve"> </w:t>
+      </w:r>
+      <w:r>
+        <w:t xml:space="preserve">+ the session file change.</w:t>
+      </w:r>
+    </w:p>
+    <w:bookmarkEnd w:id="63"/>
+    <w:bookmarkStart w:id="64" w:name="step-3-add-the-qa-account-to-the-chat"/>
+    <w:p>
+      <w:pPr>
+        <w:pStyle w:val="Heading3"/>
+      </w:pPr>
+      <w:r>
+        <w:t xml:space="preserve">Step 3: Add the QA account to the chat</w:t>
+      </w:r>
+    </w:p>
+    <w:p>
+      <w:pPr>
+        <w:pStyle w:val="FirstParagraph"/>
+      </w:pPr>
+      <w:r>
+        <w:t xml:space="preserve">The QA user account MUST be a member of</w:t>
+      </w:r>
+      <w:r>
+        <w:t xml:space="preserve"> </w:t>
+      </w:r>
+      <w:r>
+        <w:rPr>
+          <w:rStyle w:val="VerbatimChar"/>
+        </w:rPr>
+        <w:t xml:space="preserve">HERALD_TGRAM_CHAT_ID</w:t>
+      </w:r>
+      <w:r>
+        <w:t xml:space="preserve">. If using (a) and you're already a member: done. If using (b)/(c):</w:t>
+      </w:r>
+    </w:p>
+    <w:p>
+      <w:pPr>
+        <w:pStyle w:val="Compact"/>
+        <w:numPr>
+          <w:ilvl w:val="0"/>
+          <w:numId w:val="1016"/>
+        </w:numPr>
+      </w:pPr>
+      <w:r>
+        <w:t xml:space="preserve">Have an existing member of the group invite the new account (group invite link or add-by-phone).</w:t>
+      </w:r>
+    </w:p>
+    <w:p>
+      <w:pPr>
+        <w:pStyle w:val="Compact"/>
+        <w:numPr>
+          <w:ilvl w:val="0"/>
+          <w:numId w:val="1016"/>
+        </w:numPr>
+      </w:pPr>
+      <w:r>
+        <w:t xml:space="preserve">Verify membership before running the test: log into Telegram as the QA account and confirm the group is visible.</w:t>
+      </w:r>
+    </w:p>
+    <w:bookmarkEnd w:id="64"/>
+    <w:bookmarkStart w:id="65" w:name="X42bc0db7d5971aa3ae0200e2f58bb244f7a5c74"/>
+    <w:p>
+      <w:pPr>
+        <w:pStyle w:val="Heading3"/>
+      </w:pPr>
+      <w:r>
+        <w:t xml:space="preserve">Step 4: First-run login (one-time bootstrap — §11.4.98 permitted exception)</w:t>
+      </w:r>
+    </w:p>
+    <w:p>
+      <w:pPr>
+        <w:pStyle w:val="FirstParagraph"/>
+      </w:pPr>
+      <w:r>
+        <w:t xml:space="preserve">The harness binary (planned:</w:t>
+      </w:r>
+      <w:r>
+        <w:t xml:space="preserve"> </w:t>
+      </w:r>
+      <w:r>
+        <w:rPr>
+          <w:rStyle w:val="VerbatimChar"/>
+        </w:rPr>
+        <w:t xml:space="preserve">qaherald mtproto login</w:t>
+      </w:r>
+      <w:r>
+        <w:t xml:space="preserve">) connects to Telegram MTProto, sends a login code to the QA account's Telegram app, prompts you at the CLI to type the code (+ 2FA password if applicable), and persists the resulting session to</w:t>
+      </w:r>
+      <w:r>
+        <w:t xml:space="preserve"> </w:t>
+      </w:r>
+      <w:r>
+        <w:rPr>
+          <w:rStyle w:val="VerbatimChar"/>
+        </w:rPr>
+        <w:t xml:space="preserve">HERALD_MTPROTO_SESSION_FILE</w:t>
+      </w:r>
+      <w:r>
+        <w:t xml:space="preserve"> </w:t>
+      </w:r>
+      <w:r>
+        <w:t xml:space="preserve">(default</w:t>
+      </w:r>
+      <w:r>
+        <w:t xml:space="preserve"> </w:t>
+      </w:r>
+      <w:r>
+        <w:rPr>
+          <w:rStyle w:val="VerbatimChar"/>
+        </w:rPr>
+        <w:t xml:space="preserve">~/.config/herald/mtproto.session</w:t>
+      </w:r>
+      <w:r>
+        <w:t xml:space="preserve">). This is a</w:t>
+      </w:r>
+      <w:r>
+        <w:t xml:space="preserve"> </w:t>
+      </w:r>
+      <w:r>
+        <w:rPr>
+          <w:b/>
+          <w:bCs/>
+        </w:rPr>
+        <w:t xml:space="preserve">one-time interactive step</w:t>
+      </w:r>
+      <w:r>
+        <w:t xml:space="preserve">; subsequent test runs are fully autonomous (the §11.4.98 single permitted exception — configuration, not test driving).</w:t>
+      </w:r>
+    </w:p>
+    <w:p>
+      <w:pPr>
+        <w:pStyle w:val="BodyText"/>
+      </w:pPr>
+      <w:r>
+        <w:rPr>
+          <w:b/>
+          <w:bCs/>
+        </w:rPr>
+        <w:t xml:space="preserve">Workflow (planned — implementation under Wave 8 Track B):</w:t>
+      </w:r>
+    </w:p>
+    <w:p>
+      <w:pPr>
+        <w:pStyle w:val="SourceCode"/>
+      </w:pPr>
+      <w:r>
+        <w:rPr>
+          <w:rStyle w:val="CommentTok"/>
+        </w:rPr>
+        <w:t xml:space="preserve"># After populating .env with the 3 MTProto vars:</w:t>
+      </w:r>
+      <w:r>
+        <w:br/>
+      </w:r>
+      <w:r>
+        <w:rPr>
+          <w:rStyle w:val="BuiltInTok"/>
+        </w:rPr>
+        <w:t xml:space="preserve">set</w:t>
+      </w:r>
+      <w:r>
+        <w:rPr>
+          <w:rStyle w:val="NormalTok"/>
+        </w:rPr>
+        <w:t xml:space="preserve"> </w:t>
+      </w:r>
+      <w:r>
+        <w:rPr>
+          <w:rStyle w:val="AttributeTok"/>
+        </w:rPr>
+        <w:t xml:space="preserve">-a</w:t>
+      </w:r>
+      <w:r>
+        <w:rPr>
+          <w:rStyle w:val="KeywordTok"/>
+        </w:rPr>
+        <w:t xml:space="preserve">;</w:t>
+      </w:r>
+      <w:r>
+        <w:rPr>
+          <w:rStyle w:val="NormalTok"/>
+        </w:rPr>
+        <w:t xml:space="preserve"> </w:t>
+      </w:r>
+      <w:r>
+        <w:rPr>
+          <w:rStyle w:val="BuiltInTok"/>
+        </w:rPr>
+        <w:t xml:space="preserve">source</w:t>
+      </w:r>
+      <w:r>
+        <w:rPr>
+          <w:rStyle w:val="NormalTok"/>
+        </w:rPr>
+        <w:t xml:space="preserve"> .env</w:t>
+      </w:r>
+      <w:r>
+        <w:rPr>
+          <w:rStyle w:val="KeywordTok"/>
+        </w:rPr>
+        <w:t xml:space="preserve">;</w:t>
+      </w:r>
+      <w:r>
+        <w:rPr>
+          <w:rStyle w:val="NormalTok"/>
+        </w:rPr>
+        <w:t xml:space="preserve"> </w:t>
+      </w:r>
+      <w:r>
+        <w:rPr>
+          <w:rStyle w:val="BuiltInTok"/>
+        </w:rPr>
+        <w:t xml:space="preserve">set</w:t>
+      </w:r>
+      <w:r>
+        <w:rPr>
+          <w:rStyle w:val="NormalTok"/>
+        </w:rPr>
+        <w:t xml:space="preserve"> +a</w:t>
+      </w:r>
+      <w:r>
+        <w:br/>
+      </w:r>
+      <w:r>
+        <w:br/>
+      </w:r>
+      <w:r>
+        <w:rPr>
+          <w:rStyle w:val="CommentTok"/>
+        </w:rPr>
+        <w:t xml:space="preserve"># One-time interactive login:</w:t>
+      </w:r>
+      <w:r>
+        <w:br/>
+      </w:r>
+      <w:r>
+        <w:rPr>
+          <w:rStyle w:val="ExtensionTok"/>
+        </w:rPr>
+        <w:t xml:space="preserve">qaherald</w:t>
+      </w:r>
+      <w:r>
+        <w:rPr>
+          <w:rStyle w:val="NormalTok"/>
+        </w:rPr>
+        <w:t xml:space="preserve"> mtproto login</w:t>
+      </w:r>
+      <w:r>
+        <w:br/>
+      </w:r>
+      <w:r>
+        <w:rPr>
+          <w:rStyle w:val="CommentTok"/>
+        </w:rPr>
+        <w:t xml:space="preserve">#   → prompts: "Enter code Telegram sent to &lt;phone&gt;:"</w:t>
+      </w:r>
+      <w:r>
+        <w:br/>
+      </w:r>
+      <w:r>
+        <w:rPr>
+          <w:rStyle w:val="CommentTok"/>
+        </w:rPr>
+        <w:t xml:space="preserve">#   → if 2FA enabled: "Enter cloud password:"</w:t>
+      </w:r>
+      <w:r>
+        <w:br/>
+      </w:r>
+      <w:r>
+        <w:rPr>
+          <w:rStyle w:val="CommentTok"/>
+        </w:rPr>
+        <w:t xml:space="preserve">#   → on success: writes ~/.config/herald/mtproto.session</w:t>
+      </w:r>
+      <w:r>
+        <w:br/>
+      </w:r>
+      <w:r>
+        <w:rPr>
+          <w:rStyle w:val="CommentTok"/>
+        </w:rPr>
+        <w:t xml:space="preserve">#   → prints: "MTProto session active for @&lt;username&gt; (user_id=&lt;id&gt;)"</w:t>
+      </w:r>
+      <w:r>
+        <w:br/>
+      </w:r>
+      <w:r>
+        <w:br/>
+      </w:r>
+      <w:r>
+        <w:rPr>
+          <w:rStyle w:val="CommentTok"/>
+        </w:rPr>
+        <w:t xml:space="preserve"># Subsequent test runs (FULLY AUTONOMOUS — no CLI prompts):</w:t>
+      </w:r>
+      <w:r>
+        <w:br/>
+      </w:r>
+      <w:r>
+        <w:rPr>
+          <w:rStyle w:val="ExtensionTok"/>
+        </w:rPr>
+        <w:t xml:space="preserve">go</w:t>
+      </w:r>
+      <w:r>
+        <w:rPr>
+          <w:rStyle w:val="NormalTok"/>
+        </w:rPr>
+        <w:t xml:space="preserve"> test </w:t>
+      </w:r>
+      <w:r>
+        <w:rPr>
+          <w:rStyle w:val="AttributeTok"/>
+        </w:rPr>
+        <w:t xml:space="preserve">-tags</w:t>
+      </w:r>
+      <w:r>
+        <w:rPr>
+          <w:rStyle w:val="OperatorTok"/>
+        </w:rPr>
+        <w:t xml:space="preserve">=</w:t>
+      </w:r>
+      <w:r>
+        <w:rPr>
+          <w:rStyle w:val="NormalTok"/>
+        </w:rPr>
+        <w:t xml:space="preserve">integration_mtproto </w:t>
+      </w:r>
+      <w:r>
+        <w:rPr>
+          <w:rStyle w:val="AttributeTok"/>
+        </w:rPr>
+        <w:t xml:space="preserve">-count</w:t>
+      </w:r>
+      <w:r>
+        <w:rPr>
+          <w:rStyle w:val="OperatorTok"/>
+        </w:rPr>
+        <w:t xml:space="preserve">=</w:t>
+      </w:r>
+      <w:r>
+        <w:rPr>
+          <w:rStyle w:val="NormalTok"/>
+        </w:rPr>
+        <w:t xml:space="preserve">3 </w:t>
+      </w:r>
+      <w:r>
+        <w:rPr>
+          <w:rStyle w:val="AttributeTok"/>
+        </w:rPr>
+        <w:t xml:space="preserve">-run</w:t>
+      </w:r>
+      <w:r>
+        <w:rPr>
+          <w:rStyle w:val="NormalTok"/>
+        </w:rPr>
+        <w:t xml:space="preserve"> TestSubscribe_LiveMTProto </w:t>
+      </w:r>
+      <w:r>
+        <w:rPr>
+          <w:rStyle w:val="DataTypeTok"/>
+        </w:rPr>
+        <w:t xml:space="preserve">\</w:t>
+      </w:r>
+      <w:r>
+        <w:br/>
+      </w:r>
+      <w:r>
+        <w:rPr>
+          <w:rStyle w:val="NormalTok"/>
+        </w:rPr>
+        <w:t xml:space="preserve">    ./commons_messaging/channels/tgram/...</w:t>
+      </w:r>
+    </w:p>
+    <w:bookmarkEnd w:id="65"/>
+    <w:bookmarkStart w:id="66" w:name="step-5-verify-1"/>
+    <w:p>
+      <w:pPr>
+        <w:pStyle w:val="Heading3"/>
+      </w:pPr>
+      <w:r>
+        <w:t xml:space="preserve">Step 5: Verify</w:t>
+      </w:r>
+    </w:p>
+    <w:p>
+      <w:pPr>
+        <w:pStyle w:val="FirstParagraph"/>
+      </w:pPr>
+      <w:r>
+        <w:t xml:space="preserve">A</w:t>
+      </w:r>
+      <w:r>
+        <w:t xml:space="preserve"> </w:t>
+      </w:r>
+      <w:r>
+        <w:rPr>
+          <w:rStyle w:val="VerbatimChar"/>
+        </w:rPr>
+        <w:t xml:space="preserve">qaherald mtproto whoami</w:t>
+      </w:r>
+      <w:r>
+        <w:t xml:space="preserve"> </w:t>
+      </w:r>
+      <w:r>
+        <w:t xml:space="preserve">command (planned) connects via the persisted session and prints the QA account's identity — proves the session is alive without sending any messages. Re-run before each CI campaign to confirm Telegram hasn't expired the session (sessions are valid indefinitely unless explicitly revoked from another device).</w:t>
+      </w:r>
+    </w:p>
+    <w:bookmarkEnd w:id="66"/>
+    <w:bookmarkStart w:id="67" w:name="security-notes-composes-with-11410"/>
+    <w:p>
+      <w:pPr>
+        <w:pStyle w:val="Heading3"/>
+      </w:pPr>
+      <w:r>
+        <w:t xml:space="preserve">Security notes (composes with §11.4.10)</w:t>
+      </w:r>
+    </w:p>
+    <w:p>
+      <w:pPr>
+        <w:pStyle w:val="Compact"/>
+        <w:numPr>
+          <w:ilvl w:val="0"/>
+          <w:numId w:val="1017"/>
+        </w:numPr>
+      </w:pPr>
+      <w:r>
+        <w:rPr>
+          <w:b/>
+          <w:bCs/>
+        </w:rPr>
+        <w:t xml:space="preserve">Never commit</w:t>
+      </w:r>
+      <w:r>
+        <w:rPr>
+          <w:b/>
+          <w:bCs/>
+        </w:rPr>
+        <w:t xml:space="preserve"> </w:t>
+      </w:r>
+      <w:r>
+        <w:rPr>
+          <w:rStyle w:val="VerbatimChar"/>
+          <w:b/>
+          <w:bCs/>
+        </w:rPr>
+        <w:t xml:space="preserve">HERALD_MTPROTO_APP_HASH</w:t>
+      </w:r>
+      <w:r>
+        <w:rPr>
+          <w:b/>
+          <w:bCs/>
+        </w:rPr>
+        <w:t xml:space="preserve"> </w:t>
+      </w:r>
+      <w:r>
+        <w:rPr>
+          <w:b/>
+          <w:bCs/>
+        </w:rPr>
+        <w:t xml:space="preserve">or the session file to git.</w:t>
+      </w:r>
+      <w:r>
+        <w:t xml:space="preserve"> </w:t>
+      </w:r>
+      <w:r>
+        <w:t xml:space="preserve">Both are sufficient to impersonate the QA account.</w:t>
+      </w:r>
+    </w:p>
+    <w:p>
+      <w:pPr>
+        <w:pStyle w:val="Compact"/>
+        <w:numPr>
+          <w:ilvl w:val="0"/>
+          <w:numId w:val="1017"/>
+        </w:numPr>
+      </w:pPr>
+      <w:r>
+        <w:rPr>
+          <w:b/>
+          <w:bCs/>
+        </w:rPr>
+        <w:t xml:space="preserve">Never share the api_hash with another project.</w:t>
+      </w:r>
+      <w:r>
+        <w:t xml:space="preserve"> </w:t>
+      </w:r>
+      <w:r>
+        <w:t xml:space="preserve">Each project gets its own my.telegram.org app per Telegram's terms; sharing risks rate-limit bans across both.</w:t>
+      </w:r>
+    </w:p>
+    <w:p>
+      <w:pPr>
+        <w:pStyle w:val="Compact"/>
+        <w:numPr>
+          <w:ilvl w:val="0"/>
+          <w:numId w:val="1017"/>
+        </w:numPr>
+      </w:pPr>
+      <w:r>
+        <w:rPr>
+          <w:b/>
+          <w:bCs/>
+        </w:rPr>
+        <w:t xml:space="preserve">Treat the session file like an SSH private key.</w:t>
+      </w:r>
+      <w:r>
+        <w:t xml:space="preserve"> </w:t>
+      </w:r>
+      <w:r>
+        <w:rPr>
+          <w:rStyle w:val="VerbatimChar"/>
+        </w:rPr>
+        <w:t xml:space="preserve">chmod 600</w:t>
+      </w:r>
+      <w:r>
+        <w:t xml:space="preserve">, owned by the running user, never world-readable.</w:t>
+      </w:r>
+    </w:p>
+    <w:p>
+      <w:pPr>
+        <w:pStyle w:val="Compact"/>
+        <w:numPr>
+          <w:ilvl w:val="0"/>
+          <w:numId w:val="1017"/>
+        </w:numPr>
+      </w:pPr>
+      <w:r>
+        <w:rPr>
+          <w:b/>
+          <w:bCs/>
+        </w:rPr>
+        <w:t xml:space="preserve">Rotate the api_hash + invalidate the session</w:t>
+      </w:r>
+      <w:r>
+        <w:t xml:space="preserve"> </w:t>
+      </w:r>
+      <w:r>
+        <w:t xml:space="preserve">if leaked: my.telegram.org/apps → revoke + recreate; then</w:t>
+      </w:r>
+      <w:r>
+        <w:t xml:space="preserve"> </w:t>
+      </w:r>
+      <w:r>
+        <w:rPr>
+          <w:rStyle w:val="VerbatimChar"/>
+        </w:rPr>
+        <w:t xml:space="preserve">rm ~/.config/herald/mtproto.session</w:t>
+      </w:r>
+      <w:r>
+        <w:t xml:space="preserve"> </w:t>
+      </w:r>
+      <w:r>
+        <w:t xml:space="preserve">and re-login.</w:t>
+      </w:r>
+    </w:p>
+    <w:p>
+      <w:pPr>
+        <w:pStyle w:val="Compact"/>
+        <w:numPr>
+          <w:ilvl w:val="0"/>
+          <w:numId w:val="1017"/>
+        </w:numPr>
+      </w:pPr>
+      <w:r>
+        <w:rPr>
+          <w:b/>
+          <w:bCs/>
+        </w:rPr>
+        <w:t xml:space="preserve">HRD-133 sanitizer applies to MTProto errors too</w:t>
+      </w:r>
+      <w:r>
+        <w:t xml:space="preserve"> </w:t>
+      </w:r>
+      <w:r>
+        <w:t xml:space="preserve">— the harness MUST</w:t>
+      </w:r>
+      <w:r>
+        <w:t xml:space="preserve"> </w:t>
+      </w:r>
+      <w:r>
+        <w:rPr>
+          <w:rStyle w:val="VerbatimChar"/>
+        </w:rPr>
+        <w:t xml:space="preserve">sanitizeMTProtoError()</w:t>
+      </w:r>
+      <w:r>
+        <w:t xml:space="preserve"> </w:t>
+      </w:r>
+      <w:r>
+        <w:t xml:space="preserve">wrap every error path to ensure api_hash, session bytes, and 2FA password text never appear in committed logs /</w:t>
+      </w:r>
+      <w:r>
+        <w:t xml:space="preserve"> </w:t>
+      </w:r>
+      <w:r>
+        <w:rPr>
+          <w:rStyle w:val="VerbatimChar"/>
+        </w:rPr>
+        <w:t xml:space="preserve">docs/qa/</w:t>
+      </w:r>
+      <w:r>
+        <w:t xml:space="preserve"> </w:t>
+      </w:r>
+      <w:r>
+        <w:t xml:space="preserve">transcripts.</w:t>
+      </w:r>
+    </w:p>
+    <w:bookmarkEnd w:id="67"/>
+    <w:bookmarkStart w:id="68" w:name="audit-trail-per-11498"/>
+    <w:p>
+      <w:pPr>
+        <w:pStyle w:val="Heading3"/>
+      </w:pPr>
+      <w:r>
+        <w:t xml:space="preserve">Audit trail per §11.4.98</w:t>
+      </w:r>
+    </w:p>
+    <w:p>
+      <w:pPr>
+        <w:pStyle w:val="FirstParagraph"/>
+      </w:pPr>
+      <w:r>
+        <w:t xml:space="preserve">After Wave 8 Track B lands, every closed-loop run produces a transcript under</w:t>
+      </w:r>
+      <w:r>
+        <w:t xml:space="preserve"> </w:t>
+      </w:r>
+      <w:r>
+        <w:rPr>
+          <w:rStyle w:val="VerbatimChar"/>
+        </w:rPr>
+        <w:t xml:space="preserve">docs/qa/HRD-LIVE-MTPROTO-&lt;TS&gt;/</w:t>
+      </w:r>
+      <w:r>
+        <w:t xml:space="preserve"> </w:t>
+      </w:r>
+      <w:r>
+        <w:t xml:space="preserve">documenting:</w:t>
+      </w:r>
+    </w:p>
+    <w:p>
+      <w:pPr>
+        <w:pStyle w:val="Compact"/>
+        <w:numPr>
+          <w:ilvl w:val="0"/>
+          <w:numId w:val="1018"/>
+        </w:numPr>
+      </w:pPr>
+      <w:r>
+        <w:t xml:space="preserve">Tests executed (</w:t>
+      </w:r>
+      <w:r>
+        <w:rPr>
+          <w:rStyle w:val="VerbatimChar"/>
+        </w:rPr>
+        <w:t xml:space="preserve">TestSubscribe_LiveMTProto</w:t>
+      </w:r>
+      <w:r>
+        <w:t xml:space="preserve">,</w:t>
+      </w:r>
+      <w:r>
+        <w:t xml:space="preserve"> </w:t>
+      </w:r>
+      <w:r>
+        <w:rPr>
+          <w:rStyle w:val="VerbatimChar"/>
+        </w:rPr>
+        <w:t xml:space="preserve">TestWave6_LiveMTProto_ClosedLoop</w:t>
+      </w:r>
+      <w:r>
+        <w:t xml:space="preserve">, etc.)</w:t>
+      </w:r>
+    </w:p>
+    <w:p>
+      <w:pPr>
+        <w:pStyle w:val="Compact"/>
+        <w:numPr>
+          <w:ilvl w:val="0"/>
+          <w:numId w:val="1018"/>
+        </w:numPr>
+      </w:pPr>
+      <w:r>
+        <w:rPr>
+          <w:rStyle w:val="VerbatimChar"/>
+        </w:rPr>
+        <w:t xml:space="preserve">-count=3</w:t>
+      </w:r>
+      <w:r>
+        <w:t xml:space="preserve"> </w:t>
+      </w:r>
+      <w:r>
+        <w:t xml:space="preserve">consecutive PASS proof per §11.4.98 rule (4)</w:t>
+      </w:r>
+    </w:p>
+    <w:p>
+      <w:pPr>
+        <w:pStyle w:val="Compact"/>
+        <w:numPr>
+          <w:ilvl w:val="0"/>
+          <w:numId w:val="1018"/>
+        </w:numPr>
+      </w:pPr>
+      <w:r>
+        <w:t xml:space="preserve">Self-cleaning state proof (chat-cleanup, session-file unchanged)</w:t>
+      </w:r>
+    </w:p>
+    <w:p>
+      <w:pPr>
+        <w:pStyle w:val="Compact"/>
+        <w:numPr>
+          <w:ilvl w:val="0"/>
+          <w:numId w:val="1018"/>
+        </w:numPr>
+      </w:pPr>
+      <w:r>
+        <w:t xml:space="preserve">Sanitizer audit (token-shape regex + api_hash-shape regex on all transcripts → 0 matches required)</w:t>
+      </w:r>
+    </w:p>
+    <w:p>
+      <w:pPr>
+        <w:pStyle w:val="Compact"/>
+        <w:numPr>
+          <w:ilvl w:val="0"/>
+          <w:numId w:val="1018"/>
+        </w:numPr>
+      </w:pPr>
+      <w:r>
+        <w:t xml:space="preserve">COMPLIANT classification per §108.m audit (release-gate item)</w:t>
+      </w:r>
+    </w:p>
+    <w:p>
+      <w:pPr>
+        <w:pStyle w:val="FirstParagraph"/>
+      </w:pPr>
+      <w:r>
+        <w:t xml:space="preserve">A</w:t>
+      </w:r>
+      <w:r>
+        <w:t xml:space="preserve"> </w:t>
+      </w:r>
+      <w:r>
+        <w:rPr>
+          <w:rStyle w:val="VerbatimChar"/>
+        </w:rPr>
+        <w:t xml:space="preserve">TestSubscribe_LiveMTProto</w:t>
+      </w:r>
+      <w:r>
+        <w:t xml:space="preserve"> </w:t>
+      </w:r>
+      <w:r>
+        <w:t xml:space="preserve">test that requires any human action during execution is a release-blocking defect. SKIP-with-reason (when credentials absent) is the §11.4.3 correct posture; SKIP-reported-as-PASS or stale-evidence is forbidden.</w:t>
+      </w:r>
+    </w:p>
+    <w:bookmarkEnd w:id="68"/>
+    <w:bookmarkStart w:id="69" w:name="troubleshooting-1"/>
+    <w:p>
+      <w:pPr>
+        <w:pStyle w:val="Heading3"/>
+      </w:pPr>
+      <w:r>
+        <w:t xml:space="preserve">Troubleshooting</w:t>
+      </w:r>
+    </w:p>
+    <w:p>
+      <w:pPr>
+        <w:pStyle w:val="FirstParagraph"/>
+      </w:pPr>
+      <w:r>
+        <w:rPr>
+          <w:rStyle w:val="VerbatimChar"/>
+          <w:b/>
+          <w:bCs/>
+        </w:rPr>
+        <w:t xml:space="preserve">AUTH_KEY_UNREGISTERED</w:t>
+      </w:r>
+      <w:r>
+        <w:rPr>
+          <w:b/>
+          <w:bCs/>
+        </w:rPr>
+        <w:t xml:space="preserve"> </w:t>
+      </w:r>
+      <w:r>
+        <w:rPr>
+          <w:b/>
+          <w:bCs/>
+        </w:rPr>
+        <w:t xml:space="preserve">on first run</w:t>
+      </w:r>
+      <w:r>
+        <w:t xml:space="preserve">: The session file from a previous account is still present.</w:t>
+      </w:r>
+      <w:r>
+        <w:t xml:space="preserve"> </w:t>
+      </w:r>
+      <w:r>
+        <w:rPr>
+          <w:rStyle w:val="VerbatimChar"/>
+        </w:rPr>
+        <w:t xml:space="preserve">rm ~/.config/herald/mtproto.session</w:t>
+      </w:r>
+      <w:r>
+        <w:t xml:space="preserve"> </w:t>
+      </w:r>
+      <w:r>
+        <w:t xml:space="preserve">and re-run</w:t>
+      </w:r>
+      <w:r>
+        <w:t xml:space="preserve"> </w:t>
+      </w:r>
+      <w:r>
+        <w:rPr>
+          <w:rStyle w:val="VerbatimChar"/>
+        </w:rPr>
+        <w:t xml:space="preserve">qaherald mtproto login</w:t>
+      </w:r>
+      <w:r>
+        <w:t xml:space="preserve">.</w:t>
+      </w:r>
+    </w:p>
+    <w:p>
+      <w:pPr>
+        <w:pStyle w:val="BodyText"/>
+      </w:pPr>
+      <w:r>
+        <w:rPr>
+          <w:rStyle w:val="VerbatimChar"/>
+          <w:b/>
+          <w:bCs/>
+        </w:rPr>
+        <w:t xml:space="preserve">PHONE_CODE_INVALID</w:t>
+      </w:r>
+      <w:r>
+        <w:t xml:space="preserve">: The login code was entered wrong or expired (codes valid ~5 minutes). Re-run; Telegram sends a fresh one.</w:t>
+      </w:r>
+    </w:p>
+    <w:p>
+      <w:pPr>
+        <w:pStyle w:val="BodyText"/>
+      </w:pPr>
+      <w:r>
+        <w:rPr>
+          <w:rStyle w:val="VerbatimChar"/>
+          <w:b/>
+          <w:bCs/>
+        </w:rPr>
+        <w:t xml:space="preserve">SESSION_PASSWORD_NEEDED</w:t>
+      </w:r>
+      <w:r>
+        <w:t xml:space="preserve">: The QA account has 2FA enabled. Add</w:t>
+      </w:r>
+      <w:r>
+        <w:t xml:space="preserve"> </w:t>
+      </w:r>
+      <w:r>
+        <w:rPr>
+          <w:rStyle w:val="VerbatimChar"/>
+        </w:rPr>
+        <w:t xml:space="preserve">HERALD_MTPROTO_PASSWORD=&lt;your cloud password&gt;</w:t>
+      </w:r>
+      <w:r>
+        <w:t xml:space="preserve"> </w:t>
+      </w:r>
+      <w:r>
+        <w:t xml:space="preserve">to</w:t>
+      </w:r>
+      <w:r>
+        <w:t xml:space="preserve"> </w:t>
+      </w:r>
+      <w:r>
+        <w:rPr>
+          <w:rStyle w:val="VerbatimChar"/>
+        </w:rPr>
+        <w:t xml:space="preserve">.env</w:t>
+      </w:r>
+      <w:r>
+        <w:t xml:space="preserve"> </w:t>
+      </w:r>
+      <w:r>
+        <w:t xml:space="preserve">and re-run.</w:t>
+      </w:r>
+    </w:p>
+    <w:p>
+      <w:pPr>
+        <w:pStyle w:val="BodyText"/>
+      </w:pPr>
+      <w:r>
+        <w:rPr>
+          <w:rStyle w:val="VerbatimChar"/>
+          <w:b/>
+          <w:bCs/>
+        </w:rPr>
+        <w:t xml:space="preserve">FLOOD_WAIT_&lt;N&gt;</w:t>
+      </w:r>
+      <w:r>
+        <w:t xml:space="preserve">: Telegram is rate-limiting login attempts on this phone. Wait</w:t>
+      </w:r>
+      <w:r>
+        <w:t xml:space="preserve"> </w:t>
+      </w:r>
+      <w:r>
+        <w:rPr>
+          <w:rStyle w:val="VerbatimChar"/>
+        </w:rPr>
+        <w:t xml:space="preserve">&lt;N&gt;</w:t>
+      </w:r>
+      <w:r>
+        <w:t xml:space="preserve"> </w:t>
+      </w:r>
+      <w:r>
+        <w:t xml:space="preserve">seconds (could be hours during aggressive throttling).</w:t>
+      </w:r>
+    </w:p>
+    <w:p>
+      <w:pPr>
+        <w:pStyle w:val="BodyText"/>
+      </w:pPr>
+      <w:r>
+        <w:rPr>
+          <w:rStyle w:val="VerbatimChar"/>
+          <w:b/>
+          <w:bCs/>
+        </w:rPr>
+        <w:t xml:space="preserve">PHONE_NUMBER_INVALID</w:t>
+      </w:r>
+      <w:r>
+        <w:t xml:space="preserve">: Wrong E.164 format. Use</w:t>
+      </w:r>
+      <w:r>
+        <w:t xml:space="preserve"> </w:t>
+      </w:r>
+      <w:r>
+        <w:rPr>
+          <w:rStyle w:val="VerbatimChar"/>
+        </w:rPr>
+        <w:t xml:space="preserve">+&lt;country code&gt;&lt;number&gt;</w:t>
+      </w:r>
+      <w:r>
+        <w:t xml:space="preserve"> </w:t>
+      </w:r>
+      <w:r>
+        <w:t xml:space="preserve">with no spaces or dashes (e.g.</w:t>
+      </w:r>
+      <w:r>
+        <w:t xml:space="preserve"> </w:t>
+      </w:r>
+      <w:r>
+        <w:rPr>
+          <w:rStyle w:val="VerbatimChar"/>
+        </w:rPr>
+        <w:t xml:space="preserve">+12025551234</w:t>
+      </w:r>
+      <w:r>
+        <w:t xml:space="preserve">).</w:t>
+      </w:r>
+    </w:p>
+    <w:p>
+      <w:pPr>
+        <w:pStyle w:val="BodyText"/>
+      </w:pPr>
+      <w:r>
+        <w:rPr>
+          <w:rStyle w:val="VerbatimChar"/>
+          <w:b/>
+          <w:bCs/>
+        </w:rPr>
+        <w:t xml:space="preserve">USER_DEACTIVATED</w:t>
+      </w:r>
+      <w:r>
+        <w:t xml:space="preserve">: Telegram has deactivated the QA account (often happens to VoIP / suspicious-pattern accounts). Use option (b) — dedicated SIM.</w:t>
+      </w:r>
+    </w:p>
+    <w:p>
+      <w:pPr>
+        <w:pStyle w:val="BodyText"/>
+      </w:pPr>
+      <w:r>
+        <w:rPr>
+          <w:b/>
+          <w:bCs/>
+        </w:rPr>
+        <w:t xml:space="preserve">The harness sends messages but</w:t>
+      </w:r>
+      <w:r>
+        <w:rPr>
+          <w:b/>
+          <w:bCs/>
+        </w:rPr>
+        <w:t xml:space="preserve"> </w:t>
+      </w:r>
+      <w:r>
+        <w:rPr>
+          <w:rStyle w:val="VerbatimChar"/>
+          <w:b/>
+          <w:bCs/>
+        </w:rPr>
+        <w:t xml:space="preserve">@atmosphere_worker_bot</w:t>
+      </w:r>
+      <w:r>
+        <w:rPr>
+          <w:b/>
+          <w:bCs/>
+        </w:rPr>
+        <w:t xml:space="preserve">'s poller doesn't see them</w:t>
+      </w:r>
+      <w:r>
+        <w:t xml:space="preserve">: Confirm the QA account is a member of</w:t>
+      </w:r>
+      <w:r>
+        <w:t xml:space="preserve"> </w:t>
+      </w:r>
+      <w:r>
+        <w:rPr>
+          <w:rStyle w:val="VerbatimChar"/>
+        </w:rPr>
+        <w:t xml:space="preserve">HERALD_TGRAM_CHAT_ID</w:t>
+      </w:r>
+      <w:r>
+        <w:t xml:space="preserve">. The privacy boundary that blocks bot-to-bot ALSO blocks "user-not-in-chat → bot". Add the QA account to the group.</w:t>
+      </w:r>
+    </w:p>
+    <w:p>
+      <w:pPr>
+        <w:pStyle w:val="BodyText"/>
+      </w:pPr>
+      <w:r>
+        <w:rPr>
+          <w:b/>
+          <w:bCs/>
+        </w:rPr>
+        <w:t xml:space="preserve">The harness sees the worker bot's reply via</w:t>
+      </w:r>
+      <w:r>
+        <w:rPr>
+          <w:b/>
+          <w:bCs/>
+        </w:rPr>
+        <w:t xml:space="preserve"> </w:t>
+      </w:r>
+      <w:r>
+        <w:rPr>
+          <w:rStyle w:val="VerbatimChar"/>
+          <w:b/>
+          <w:bCs/>
+        </w:rPr>
+        <w:t xml:space="preserve">messages.getHistory</w:t>
+      </w:r>
+      <w:r>
+        <w:rPr>
+          <w:b/>
+          <w:bCs/>
+        </w:rPr>
+        <w:t xml:space="preserve"> </w:t>
+      </w:r>
+      <w:r>
+        <w:rPr>
+          <w:b/>
+          <w:bCs/>
+        </w:rPr>
+        <w:t xml:space="preserve">but it's not new</w:t>
+      </w:r>
+      <w:r>
+        <w:t xml:space="preserve">: MTProto returns chat history; you need to filter by</w:t>
+      </w:r>
+      <w:r>
+        <w:t xml:space="preserve"> </w:t>
+      </w:r>
+      <w:r>
+        <w:rPr>
+          <w:rStyle w:val="VerbatimChar"/>
+        </w:rPr>
+        <w:t xml:space="preserve">date &gt; test_start_time</w:t>
+      </w:r>
+      <w:r>
+        <w:t xml:space="preserve"> </w:t>
+      </w:r>
+      <w:r>
+        <w:t xml:space="preserve">to confirm the reply was sent during the test, not a stale message from a prior run. The harness</w:t>
+      </w:r>
+      <w:r>
+        <w:t xml:space="preserve"> </w:t>
+      </w:r>
+      <w:r>
+        <w:rPr>
+          <w:rStyle w:val="VerbatimChar"/>
+        </w:rPr>
+        <w:t xml:space="preserve">WaitForReply()</w:t>
+      </w:r>
+      <w:r>
+        <w:t xml:space="preserve"> </w:t>
+      </w:r>
+      <w:r>
+        <w:t xml:space="preserve">helper does this filtering — never roll your own.</w:t>
+      </w:r>
+    </w:p>
+    <w:bookmarkEnd w:id="69"/>
+    <w:bookmarkEnd w:id="70"/>
+    <w:bookmarkEnd w:id="71"/>
     <w:sectPr>
       <w:footnotePr>
         <w:numRestart w:val="eachSect"/>
@@ -8544,6 +11071,105 @@
     </w:lvlOverride>
   </w:num>
   <w:num w:numId="1012">
+    <w:abstractNumId w:val="991"/>
+  </w:num>
+  <w:num w:numId="1013">
+    <w:abstractNumId w:val="99411"/>
+    <w:lvlOverride w:ilvl="0">
+      <w:startOverride w:val="1"/>
+    </w:lvlOverride>
+    <w:lvlOverride w:ilvl="1">
+      <w:startOverride w:val="1"/>
+    </w:lvlOverride>
+    <w:lvlOverride w:ilvl="2">
+      <w:startOverride w:val="1"/>
+    </w:lvlOverride>
+    <w:lvlOverride w:ilvl="3">
+      <w:startOverride w:val="1"/>
+    </w:lvlOverride>
+    <w:lvlOverride w:ilvl="4">
+      <w:startOverride w:val="1"/>
+    </w:lvlOverride>
+    <w:lvlOverride w:ilvl="5">
+      <w:startOverride w:val="1"/>
+    </w:lvlOverride>
+    <w:lvlOverride w:ilvl="6">
+      <w:startOverride w:val="1"/>
+    </w:lvlOverride>
+    <w:lvlOverride w:ilvl="7">
+      <w:startOverride w:val="1"/>
+    </w:lvlOverride>
+    <w:lvlOverride w:ilvl="8">
+      <w:startOverride w:val="1"/>
+    </w:lvlOverride>
+  </w:num>
+  <w:num w:numId="1014">
+    <w:abstractNumId w:val="991"/>
+  </w:num>
+  <w:num w:numId="1015">
+    <w:abstractNumId w:val="991"/>
+  </w:num>
+  <w:num w:numId="1016">
+    <w:abstractNumId w:val="99411"/>
+    <w:lvlOverride w:ilvl="0">
+      <w:startOverride w:val="1"/>
+    </w:lvlOverride>
+    <w:lvlOverride w:ilvl="1">
+      <w:startOverride w:val="1"/>
+    </w:lvlOverride>
+    <w:lvlOverride w:ilvl="2">
+      <w:startOverride w:val="1"/>
+    </w:lvlOverride>
+    <w:lvlOverride w:ilvl="3">
+      <w:startOverride w:val="1"/>
+    </w:lvlOverride>
+    <w:lvlOverride w:ilvl="4">
+      <w:startOverride w:val="1"/>
+    </w:lvlOverride>
+    <w:lvlOverride w:ilvl="5">
+      <w:startOverride w:val="1"/>
+    </w:lvlOverride>
+    <w:lvlOverride w:ilvl="6">
+      <w:startOverride w:val="1"/>
+    </w:lvlOverride>
+    <w:lvlOverride w:ilvl="7">
+      <w:startOverride w:val="1"/>
+    </w:lvlOverride>
+    <w:lvlOverride w:ilvl="8">
+      <w:startOverride w:val="1"/>
+    </w:lvlOverride>
+  </w:num>
+  <w:num w:numId="1017">
+    <w:abstractNumId w:val="99411"/>
+    <w:lvlOverride w:ilvl="0">
+      <w:startOverride w:val="1"/>
+    </w:lvlOverride>
+    <w:lvlOverride w:ilvl="1">
+      <w:startOverride w:val="1"/>
+    </w:lvlOverride>
+    <w:lvlOverride w:ilvl="2">
+      <w:startOverride w:val="1"/>
+    </w:lvlOverride>
+    <w:lvlOverride w:ilvl="3">
+      <w:startOverride w:val="1"/>
+    </w:lvlOverride>
+    <w:lvlOverride w:ilvl="4">
+      <w:startOverride w:val="1"/>
+    </w:lvlOverride>
+    <w:lvlOverride w:ilvl="5">
+      <w:startOverride w:val="1"/>
+    </w:lvlOverride>
+    <w:lvlOverride w:ilvl="6">
+      <w:startOverride w:val="1"/>
+    </w:lvlOverride>
+    <w:lvlOverride w:ilvl="7">
+      <w:startOverride w:val="1"/>
+    </w:lvlOverride>
+    <w:lvlOverride w:ilvl="8">
+      <w:startOverride w:val="1"/>
+    </w:lvlOverride>
+  </w:num>
+  <w:num w:numId="1018">
     <w:abstractNumId w:val="991"/>
   </w:num>
 </w:numbering>

</xml_diff>